<commit_message>
inv009: a non-parametric check on the dose relationship
A gradient boosted model over 687,067 windows from 1,660 people, asked for the
interaction between insulin action and daily dose rather than for dose's own
effect, which is a different thing: people on more insulin are different people,
and only the multiplier on insulin is sensitivity.

Free to find any shape, it finds a monotone fall, from +0.28 mg/dL per unit at
fifteen units a day to -0.04 at seventy-seven, flattening above about forty.
That is the relationship the equations assert, found without being asked for,
and it is the shape a shallow exponent makes rather than a steep one.

Reported with the same caveat as everything else: these are shifts around the
model's own baseline and carry the same attenuation, so the direction and the
curvature are the finding and the magnitudes are not.
</commit_message>
<xml_diff>
--- a/docs/Dynamic-ISF-6-Public-Datasets-2026-08-25.docx
+++ b/docs/Dynamic-ISF-6-Public-Datasets-2026-08-25.docx
@@ -1525,7 +1525,7 @@
       </w:r>
     </w:p>
     <w:bookmarkEnd w:id="17"/>
-    <w:bookmarkStart w:id="25" w:name="X6fe54903a5df49ce0cb9aaa10e45e16932e6606"/>
+    <w:bookmarkStart w:id="26" w:name="X6fe54903a5df49ce0cb9aaa10e45e16932e6606"/>
     <w:p>
       <w:pPr>
         <w:pStyle w:val="Heading2"/>
@@ -1692,7 +1692,295 @@
         <w:t xml:space="preserve">Both numbers sit between the square root and v1, and neither is near v2.</w:t>
       </w:r>
     </w:p>
-    <w:bookmarkStart w:id="24" w:name="Xe4f1c8eba80e923e6f832fa1991eca43e27507d"/>
+    <w:bookmarkStart w:id="21" w:name="a-second-opinion-that-assumes-no-shape"/>
+    <w:p>
+      <w:pPr>
+        <w:pStyle w:val="Heading3"/>
+      </w:pPr>
+      <w:r>
+        <w:t xml:space="preserve">A second opinion that assumes no shape</w:t>
+      </w:r>
+    </w:p>
+    <w:p>
+      <w:pPr>
+        <w:pStyle w:val="FirstParagraph"/>
+      </w:pPr>
+      <w:r>
+        <w:t xml:space="preserve">Every figure above comes from fitting a shape and reading off its parameter,</w:t>
+      </w:r>
+      <w:r>
+        <w:t xml:space="preserve"> </w:t>
+      </w:r>
+      <w:r>
+        <w:t xml:space="preserve">which makes the answer only as good as the shape assumed. A gradient boosted</w:t>
+      </w:r>
+      <w:r>
+        <w:t xml:space="preserve"> </w:t>
+      </w:r>
+      <w:r>
+        <w:t xml:space="preserve">model assumes none. Given 687,067 windows from 1,660 people it is free to find</w:t>
+      </w:r>
+      <w:r>
+        <w:t xml:space="preserve"> </w:t>
+      </w:r>
+      <w:r>
+        <w:t xml:space="preserve">that sensitivity falls with dose, rises with it, moves in steps, or does not</w:t>
+      </w:r>
+      <w:r>
+        <w:t xml:space="preserve"> </w:t>
+      </w:r>
+      <w:r>
+        <w:t xml:space="preserve">depend on dose at all.</w:t>
+      </w:r>
+    </w:p>
+    <w:p>
+      <w:pPr>
+        <w:pStyle w:val="BodyText"/>
+      </w:pPr>
+      <w:r>
+        <w:t xml:space="preserve">What has to be read from it is the interaction between insulin action and daily</w:t>
+      </w:r>
+      <w:r>
+        <w:t xml:space="preserve"> </w:t>
+      </w:r>
+      <w:r>
+        <w:t xml:space="preserve">dose, not the importance of dose on its own. Dose has a large effect on how far</w:t>
+      </w:r>
+      <w:r>
+        <w:t xml:space="preserve"> </w:t>
+      </w:r>
+      <w:r>
+        <w:t xml:space="preserve">glucose falls overnight that has nothing to do with sensitivity, because people</w:t>
+      </w:r>
+      <w:r>
+        <w:t xml:space="preserve"> </w:t>
+      </w:r>
+      <w:r>
+        <w:t xml:space="preserve">on more insulin are different people. Sensitivity is the multiplier on insulin,</w:t>
+      </w:r>
+      <w:r>
+        <w:t xml:space="preserve"> </w:t>
+      </w:r>
+      <w:r>
+        <w:t xml:space="preserve">so the interaction is where it lives.</w:t>
+      </w:r>
+    </w:p>
+    <w:tbl>
+      <w:tblPr>
+        <w:tblStyle w:val="Table"/>
+        <w:tblW w:type="auto" w:w="0"/>
+        <w:tblLook w:firstRow="1" w:lastRow="0" w:firstColumn="0" w:lastColumn="0" w:noHBand="0" w:noVBand="0" w:val="0020"/>
+      </w:tblPr>
+      <w:tblGrid>
+        <w:gridCol w:w="3960"/>
+        <w:gridCol w:w="3960"/>
+      </w:tblGrid>
+      <w:tr>
+        <w:trPr>
+          <w:tblHeader w:val="on"/>
+        </w:trPr>
+        <w:tc>
+          <w:tcPr/>
+          <w:p>
+            <w:pPr>
+              <w:pStyle w:val="Compact"/>
+            </w:pPr>
+            <w:r>
+              <w:t xml:space="preserve">Daily dose</w:t>
+            </w:r>
+          </w:p>
+        </w:tc>
+        <w:tc>
+          <w:tcPr/>
+          <w:p>
+            <w:pPr>
+              <w:pStyle w:val="Compact"/>
+            </w:pPr>
+            <w:r>
+              <w:t xml:space="preserve">Shift in sensitivity attributable to dose</w:t>
+            </w:r>
+          </w:p>
+        </w:tc>
+      </w:tr>
+      <w:tr>
+        <w:tc>
+          <w:tcPr/>
+          <w:p>
+            <w:pPr>
+              <w:pStyle w:val="Compact"/>
+            </w:pPr>
+            <w:r>
+              <w:t xml:space="preserve">15 U</w:t>
+            </w:r>
+          </w:p>
+        </w:tc>
+        <w:tc>
+          <w:tcPr/>
+          <w:p>
+            <w:pPr>
+              <w:pStyle w:val="Compact"/>
+            </w:pPr>
+            <w:r>
+              <w:t xml:space="preserve">+0.28 mg/dL per unit</w:t>
+            </w:r>
+          </w:p>
+        </w:tc>
+      </w:tr>
+      <w:tr>
+        <w:tc>
+          <w:tcPr/>
+          <w:p>
+            <w:pPr>
+              <w:pStyle w:val="Compact"/>
+            </w:pPr>
+            <w:r>
+              <w:t xml:space="preserve">25 U</w:t>
+            </w:r>
+          </w:p>
+        </w:tc>
+        <w:tc>
+          <w:tcPr/>
+          <w:p>
+            <w:pPr>
+              <w:pStyle w:val="Compact"/>
+            </w:pPr>
+            <w:r>
+              <w:t xml:space="preserve">+0.06</w:t>
+            </w:r>
+          </w:p>
+        </w:tc>
+      </w:tr>
+      <w:tr>
+        <w:tc>
+          <w:tcPr/>
+          <w:p>
+            <w:pPr>
+              <w:pStyle w:val="Compact"/>
+            </w:pPr>
+            <w:r>
+              <w:t xml:space="preserve">34 U</w:t>
+            </w:r>
+          </w:p>
+        </w:tc>
+        <w:tc>
+          <w:tcPr/>
+          <w:p>
+            <w:pPr>
+              <w:pStyle w:val="Compact"/>
+            </w:pPr>
+            <w:r>
+              <w:t xml:space="preserve">+0.06</w:t>
+            </w:r>
+          </w:p>
+        </w:tc>
+      </w:tr>
+      <w:tr>
+        <w:tc>
+          <w:tcPr/>
+          <w:p>
+            <w:pPr>
+              <w:pStyle w:val="Compact"/>
+            </w:pPr>
+            <w:r>
+              <w:t xml:space="preserve">43 U</w:t>
+            </w:r>
+          </w:p>
+        </w:tc>
+        <w:tc>
+          <w:tcPr/>
+          <w:p>
+            <w:pPr>
+              <w:pStyle w:val="Compact"/>
+            </w:pPr>
+            <w:r>
+              <w:t xml:space="preserve">+0.02</w:t>
+            </w:r>
+          </w:p>
+        </w:tc>
+      </w:tr>
+      <w:tr>
+        <w:tc>
+          <w:tcPr/>
+          <w:p>
+            <w:pPr>
+              <w:pStyle w:val="Compact"/>
+            </w:pPr>
+            <w:r>
+              <w:t xml:space="preserve">55 U</w:t>
+            </w:r>
+          </w:p>
+        </w:tc>
+        <w:tc>
+          <w:tcPr/>
+          <w:p>
+            <w:pPr>
+              <w:pStyle w:val="Compact"/>
+            </w:pPr>
+            <w:r>
+              <w:t xml:space="preserve">0.00</w:t>
+            </w:r>
+          </w:p>
+        </w:tc>
+      </w:tr>
+      <w:tr>
+        <w:tc>
+          <w:tcPr/>
+          <w:p>
+            <w:pPr>
+              <w:pStyle w:val="Compact"/>
+            </w:pPr>
+            <w:r>
+              <w:t xml:space="preserve">77 U</w:t>
+            </w:r>
+          </w:p>
+        </w:tc>
+        <w:tc>
+          <w:tcPr/>
+          <w:p>
+            <w:pPr>
+              <w:pStyle w:val="Compact"/>
+            </w:pPr>
+            <w:r>
+              <w:t xml:space="preserve">-0.04</w:t>
+            </w:r>
+          </w:p>
+        </w:tc>
+      </w:tr>
+    </w:tbl>
+    <w:p>
+      <w:pPr>
+        <w:pStyle w:val="BodyText"/>
+      </w:pPr>
+      <w:r>
+        <w:t xml:space="preserve">The profile falls monotonically, which is the relationship the equations assert,</w:t>
+      </w:r>
+      <w:r>
+        <w:t xml:space="preserve"> </w:t>
+      </w:r>
+      <w:r>
+        <w:t xml:space="preserve">found without being asked for. It flattens above about forty units a day, which</w:t>
+      </w:r>
+      <w:r>
+        <w:t xml:space="preserve"> </w:t>
+      </w:r>
+      <w:r>
+        <w:t xml:space="preserve">is the shape a shallow exponent makes and not the shape a steep one makes. I</w:t>
+      </w:r>
+      <w:r>
+        <w:t xml:space="preserve"> </w:t>
+      </w:r>
+      <w:r>
+        <w:t xml:space="preserve">would not read the magnitudes as sensitivity itself: they are shifts around the</w:t>
+      </w:r>
+      <w:r>
+        <w:t xml:space="preserve"> </w:t>
+      </w:r>
+      <w:r>
+        <w:t xml:space="preserve">model’s own baseline and they carry the same attenuation as everything else here.</w:t>
+      </w:r>
+    </w:p>
+    <w:bookmarkEnd w:id="21"/>
+    <w:bookmarkStart w:id="25" w:name="Xe4f1c8eba80e923e6f832fa1991eca43e27507d"/>
     <w:p>
       <w:pPr>
         <w:pStyle w:val="Heading3"/>
@@ -1756,18 +2044,18 @@
           <wp:inline>
             <wp:extent cx="5334000" cy="2561090"/>
             <wp:effectExtent b="0" l="0" r="0" t="0"/>
-            <wp:docPr descr="The confound, made visible" title="" id="22" name="Picture"/>
+            <wp:docPr descr="The confound, made visible" title="" id="23" name="Picture"/>
             <a:graphic>
               <a:graphicData uri="http://schemas.openxmlformats.org/drawingml/2006/picture">
                 <pic:pic>
                   <pic:nvPicPr>
-                    <pic:cNvPr descr="../charts/inv009/fig_endogeneity.png" id="23" name="Picture"/>
+                    <pic:cNvPr descr="../charts/inv009/fig_endogeneity.png" id="24" name="Picture"/>
                     <pic:cNvPicPr>
                       <a:picLocks noChangeArrowheads="1" noChangeAspect="1"/>
                     </pic:cNvPicPr>
                   </pic:nvPicPr>
                   <pic:blipFill>
-                    <a:blip r:embed="rId21"/>
+                    <a:blip r:embed="rId22"/>
                     <a:stretch>
                       <a:fillRect/>
                     </a:stretch>
@@ -1879,9 +2167,9 @@
         <w:t xml:space="preserve">closest any cohort comes to v1. It does not come close to v2 either.</w:t>
       </w:r>
     </w:p>
-    <w:bookmarkEnd w:id="24"/>
     <w:bookmarkEnd w:id="25"/>
-    <w:bookmarkStart w:id="29" w:name="does-sensitivity-change-with-glucose"/>
+    <w:bookmarkEnd w:id="26"/>
+    <w:bookmarkStart w:id="30" w:name="does-sensitivity-change-with-glucose"/>
     <w:p>
       <w:pPr>
         <w:pStyle w:val="Heading2"/>
@@ -2045,18 +2333,18 @@
           <wp:inline>
             <wp:extent cx="5334000" cy="2478624"/>
             <wp:effectExtent b="0" l="0" r="0" t="0"/>
-            <wp:docPr descr="No glucose shape earns its place" title="" id="27" name="Picture"/>
+            <wp:docPr descr="No glucose shape earns its place" title="" id="28" name="Picture"/>
             <a:graphic>
               <a:graphicData uri="http://schemas.openxmlformats.org/drawingml/2006/picture">
                 <pic:pic>
                   <pic:nvPicPr>
-                    <pic:cNvPr descr="../charts/inv009/fig_glucose.png" id="28" name="Picture"/>
+                    <pic:cNvPr descr="../charts/inv009/fig_glucose.png" id="29" name="Picture"/>
                     <pic:cNvPicPr>
                       <a:picLocks noChangeArrowheads="1" noChangeAspect="1"/>
                     </pic:cNvPicPr>
                   </pic:nvPicPr>
                   <pic:blipFill>
-                    <a:blip r:embed="rId26"/>
+                    <a:blip r:embed="rId27"/>
                     <a:stretch>
                       <a:fillRect/>
                     </a:stretch>
@@ -2123,8 +2411,8 @@
         <w:t xml:space="preserve">place. Nothing came within a tenth of that.</w:t>
       </w:r>
     </w:p>
-    <w:bookmarkEnd w:id="29"/>
-    <w:bookmarkStart w:id="33" w:name="predicting-the-night"/>
+    <w:bookmarkEnd w:id="30"/>
+    <w:bookmarkStart w:id="34" w:name="predicting-the-night"/>
     <w:p>
       <w:pPr>
         <w:pStyle w:val="Heading2"/>
@@ -2194,18 +2482,18 @@
           <wp:inline>
             <wp:extent cx="5334000" cy="2552153"/>
             <wp:effectExtent b="0" l="0" r="0" t="0"/>
-            <wp:docPr descr="Predicting the overnight fall" title="" id="31" name="Picture"/>
+            <wp:docPr descr="Predicting the overnight fall" title="" id="32" name="Picture"/>
             <a:graphic>
               <a:graphicData uri="http://schemas.openxmlformats.org/drawingml/2006/picture">
                 <pic:pic>
                   <pic:nvPicPr>
-                    <pic:cNvPr descr="../charts/inv009/fig_head_to_head.png" id="32" name="Picture"/>
+                    <pic:cNvPr descr="../charts/inv009/fig_head_to_head.png" id="33" name="Picture"/>
                     <pic:cNvPicPr>
                       <a:picLocks noChangeArrowheads="1" noChangeAspect="1"/>
                     </pic:cNvPicPr>
                   </pic:nvPicPr>
                   <pic:blipFill>
-                    <a:blip r:embed="rId30"/>
+                    <a:blip r:embed="rId31"/>
                     <a:stretch>
                       <a:fillRect/>
                     </a:stretch>
@@ -2576,8 +2864,8 @@
         <w:t xml:space="preserve">should. Even there it is more than twice as wrong as anything else on the list.</w:t>
       </w:r>
     </w:p>
-    <w:bookmarkEnd w:id="33"/>
-    <w:bookmarkStart w:id="37" w:name="Xed0260a456a6b0c9b463a857584ff59756e5ee1"/>
+    <w:bookmarkEnd w:id="34"/>
+    <w:bookmarkStart w:id="38" w:name="Xed0260a456a6b0c9b463a857584ff59756e5ee1"/>
     <w:p>
       <w:pPr>
         <w:pStyle w:val="Heading2"/>
@@ -2633,18 +2921,18 @@
           <wp:inline>
             <wp:extent cx="5334000" cy="3595955"/>
             <wp:effectExtent b="0" l="0" r="0" t="0"/>
-            <wp:docPr descr="Recovering a known exponent" title="" id="35" name="Picture"/>
+            <wp:docPr descr="Recovering a known exponent" title="" id="36" name="Picture"/>
             <a:graphic>
               <a:graphicData uri="http://schemas.openxmlformats.org/drawingml/2006/picture">
                 <pic:pic>
                   <pic:nvPicPr>
-                    <pic:cNvPr descr="../charts/inv009/fig_synthetic.png" id="36" name="Picture"/>
+                    <pic:cNvPr descr="../charts/inv009/fig_synthetic.png" id="37" name="Picture"/>
                     <pic:cNvPicPr>
                       <a:picLocks noChangeArrowheads="1" noChangeAspect="1"/>
                     </pic:cNvPicPr>
                   </pic:nvPicPr>
                   <pic:blipFill>
-                    <a:blip r:embed="rId34"/>
+                    <a:blip r:embed="rId35"/>
                     <a:stretch>
                       <a:fillRect/>
                     </a:stretch>
@@ -2952,8 +3240,8 @@
         <w:t xml:space="preserve">The exponent is.</w:t>
       </w:r>
     </w:p>
-    <w:bookmarkEnd w:id="37"/>
-    <w:bookmarkStart w:id="38" w:name="what-this-does-not-settle"/>
+    <w:bookmarkEnd w:id="38"/>
+    <w:bookmarkStart w:id="39" w:name="what-this-does-not-settle"/>
     <w:p>
       <w:pPr>
         <w:pStyle w:val="Heading2"/>
@@ -3157,8 +3445,8 @@
         <w:t xml:space="preserve">checked against the database’s own sums.</w:t>
       </w:r>
     </w:p>
-    <w:bookmarkEnd w:id="38"/>
-    <w:bookmarkStart w:id="39" w:name="where-this-leaves-the-two-equations"/>
+    <w:bookmarkEnd w:id="39"/>
+    <w:bookmarkStart w:id="40" w:name="where-this-leaves-the-two-equations"/>
     <w:p>
       <w:pPr>
         <w:pStyle w:val="Heading2"/>
@@ -3307,8 +3595,8 @@
         <w:t xml:space="preserve">factor is the right place to put this at all.</w:t>
       </w:r>
     </w:p>
-    <w:bookmarkEnd w:id="39"/>
-    <w:bookmarkStart w:id="40" w:name="method-and-reproduction"/>
+    <w:bookmarkEnd w:id="40"/>
+    <w:bookmarkStart w:id="41" w:name="method-and-reproduction"/>
     <w:p>
       <w:pPr>
         <w:pStyle w:val="Heading2"/>
@@ -3470,8 +3758,8 @@
         <w:t xml:space="preserve">read against each other.</w:t>
       </w:r>
     </w:p>
-    <w:bookmarkEnd w:id="40"/>
-    <w:bookmarkStart w:id="41" w:name="data-attribution"/>
+    <w:bookmarkEnd w:id="41"/>
+    <w:bookmarkStart w:id="42" w:name="data-attribution"/>
     <w:p>
       <w:pPr>
         <w:pStyle w:val="Heading2"/>
@@ -3572,7 +3860,7 @@
         <w:t xml:space="preserve">intact and calendar date is not. Nothing here depends on calendar date.</w:t>
       </w:r>
     </w:p>
-    <w:bookmarkEnd w:id="41"/>
+    <w:bookmarkEnd w:id="42"/>
     <w:sectPr>
       <w:footnotePr>
         <w:numRestart w:val="eachSect"/>

</xml_diff>